<commit_message>
last changes for hw2
</commit_message>
<xml_diff>
--- a/HW1/dl_hw1_dry.docx
+++ b/HW1/dl_hw1_dry.docx
@@ -39,7 +39,15 @@
         <w:bidi w:val="0"/>
       </w:pPr>
       <w:r>
-        <w:t xml:space="preserve">Nadav Offir – 213786197 - </w:t>
+        <w:t xml:space="preserve">Nadav </w:t>
+      </w:r>
+      <w:proofErr w:type="spellStart"/>
+      <w:r>
+        <w:t>Offir</w:t>
+      </w:r>
+      <w:proofErr w:type="spellEnd"/>
+      <w:r>
+        <w:t xml:space="preserve"> – 213786197 - </w:t>
       </w:r>
       <w:hyperlink r:id="rId6" w:history="1">
         <w:r>
@@ -2819,7 +2827,21 @@
         <w:rPr>
           <w:rFonts w:eastAsiaTheme="minorEastAsia"/>
         </w:rPr>
-        <w:t>In order to converge we will demend:</w:t>
+        <w:t xml:space="preserve">In order to converge we will </w:t>
+      </w:r>
+      <w:proofErr w:type="spellStart"/>
+      <w:r>
+        <w:rPr>
+          <w:rFonts w:eastAsiaTheme="minorEastAsia"/>
+        </w:rPr>
+        <w:t>demend</w:t>
+      </w:r>
+      <w:proofErr w:type="spellEnd"/>
+      <w:r>
+        <w:rPr>
+          <w:rFonts w:eastAsiaTheme="minorEastAsia"/>
+        </w:rPr>
+        <w:t>:</w:t>
       </w:r>
       <w:r>
         <w:rPr>
@@ -3584,7 +3606,21 @@
         <w:rPr>
           <w:rFonts w:eastAsiaTheme="minorEastAsia"/>
         </w:rPr>
-        <w:t>. So we will get the same range as the previous sub-question:</w:t>
+        <w:t xml:space="preserve">. </w:t>
+      </w:r>
+      <w:proofErr w:type="gramStart"/>
+      <w:r>
+        <w:rPr>
+          <w:rFonts w:eastAsiaTheme="minorEastAsia"/>
+        </w:rPr>
+        <w:t>So</w:t>
+      </w:r>
+      <w:proofErr w:type="gramEnd"/>
+      <w:r>
+        <w:rPr>
+          <w:rFonts w:eastAsiaTheme="minorEastAsia"/>
+        </w:rPr>
+        <w:t xml:space="preserve"> we will get the same range as the previous sub-question:</w:t>
       </w:r>
       <w:r>
         <w:rPr>
@@ -13302,15 +13338,7 @@
               <w:kern w:val="0"/>
               <w14:ligatures w14:val="none"/>
             </w:rPr>
-            <m:t xml:space="preserve">= f(g(h(x))) + ϵf '(g(h(x)))g '(h(x))h </m:t>
-          </m:r>
-          <m:r>
-            <w:rPr>
-              <w:rFonts w:ascii="Cambria Math" w:eastAsia="Times New Roman" w:hAnsi="Cambria Math" w:cs="Times New Roman"/>
-              <w:kern w:val="0"/>
-              <w14:ligatures w14:val="none"/>
-            </w:rPr>
-            <m:t>'</m:t>
+            <m:t>= f(g(h(x))) + ϵf '(g(h(x)))g '(h(x))h '</m:t>
           </m:r>
           <m:d>
             <m:dPr>

</xml_diff>